<commit_message>
Doc: Finish Doc Lab2
</commit_message>
<xml_diff>
--- a/docs/SuarezJuan_Lab2.docx
+++ b/docs/SuarezJuan_Lab2.docx
@@ -437,16 +437,7 @@
           <w:szCs w:val="28"/>
         </w:rPr>
         <w:lastRenderedPageBreak/>
-        <w:t xml:space="preserve">Tema: </w:t>
-      </w:r>
-      <w:r>
-        <w:rPr>
-          <w:b/>
-          <w:bCs/>
-          <w:sz w:val="28"/>
-          <w:szCs w:val="28"/>
-        </w:rPr>
-        <w:t>Pruebas unitarias (</w:t>
+        <w:t>Tema: Pruebas unitarias (</w:t>
       </w:r>
       <w:proofErr w:type="spellStart"/>
       <w:r>
@@ -906,6 +897,7 @@
       </w:pPr>
       <w:r>
         <w:rPr>
+          <w:noProof/>
           <w:szCs w:val="24"/>
         </w:rPr>
         <w:drawing>
@@ -1062,6 +1054,7 @@
         <w:rPr>
           <w:b/>
           <w:bCs/>
+          <w:noProof/>
         </w:rPr>
         <w:drawing>
           <wp:inline distT="0" distB="0" distL="0" distR="0" wp14:anchorId="2AA1957B" wp14:editId="05F0CF2E">
@@ -1172,6 +1165,9 @@
         <w:ind w:left="0" w:firstLine="0"/>
       </w:pPr>
       <w:r>
+        <w:rPr>
+          <w:noProof/>
+        </w:rPr>
         <w:drawing>
           <wp:inline distT="0" distB="0" distL="0" distR="0" wp14:anchorId="4C3BEE43" wp14:editId="5123CC74">
             <wp:extent cx="5731510" cy="2490470"/>
@@ -1291,6 +1287,9 @@
         <w:ind w:left="0" w:firstLine="0"/>
       </w:pPr>
       <w:r>
+        <w:rPr>
+          <w:noProof/>
+        </w:rPr>
         <w:drawing>
           <wp:inline distT="0" distB="0" distL="0" distR="0" wp14:anchorId="59961F5A" wp14:editId="09804683">
             <wp:extent cx="5731510" cy="3672840"/>
@@ -1461,6 +1460,7 @@
         <w:rPr>
           <w:b/>
           <w:bCs/>
+          <w:noProof/>
         </w:rPr>
         <w:drawing>
           <wp:anchor distT="0" distB="0" distL="114300" distR="114300" simplePos="0" relativeHeight="251658240" behindDoc="0" locked="0" layoutInCell="1" allowOverlap="1" wp14:anchorId="43A7FF2D" wp14:editId="6370C38C">
@@ -2499,14 +2499,14 @@
         <w:rPr>
           <w:lang w:val="es-ES"/>
         </w:rPr>
-        <w:t xml:space="preserve"> T</w:t>
+        <w:t xml:space="preserve"> </w:t>
       </w:r>
       <w:proofErr w:type="spellStart"/>
       <w:r>
         <w:rPr>
           <w:lang w:val="es-ES"/>
         </w:rPr>
-        <w:t>axCalculator</w:t>
+        <w:t>TaxCalculator</w:t>
       </w:r>
       <w:proofErr w:type="spellEnd"/>
       <w:r>
@@ -2539,6 +2539,7 @@
       </w:pPr>
       <w:r>
         <w:rPr>
+          <w:noProof/>
           <w:lang w:val="es-ES"/>
         </w:rPr>
         <w:drawing>
@@ -2625,6 +2626,394 @@
           <w:lang w:val="es-ES"/>
         </w:rPr>
         <w:t>().</w:t>
+      </w:r>
+    </w:p>
+    <w:p>
+      <w:pPr>
+        <w:ind w:left="0" w:firstLine="0"/>
+        <w:rPr>
+          <w:lang w:val="es-ES"/>
+        </w:rPr>
+      </w:pPr>
+    </w:p>
+    <w:p>
+      <w:pPr>
+        <w:ind w:left="0" w:firstLine="0"/>
+        <w:rPr>
+          <w:lang w:val="es-ES"/>
+        </w:rPr>
+      </w:pPr>
+    </w:p>
+    <w:p>
+      <w:pPr>
+        <w:ind w:left="0" w:firstLine="0"/>
+        <w:rPr>
+          <w:lang w:val="es-ES"/>
+        </w:rPr>
+      </w:pPr>
+      <w:r>
+        <w:rPr>
+          <w:lang w:val="es-ES"/>
+        </w:rPr>
+        <w:drawing>
+          <wp:inline distT="0" distB="0" distL="0" distR="0" wp14:anchorId="21757D47" wp14:editId="2D4614AD">
+            <wp:extent cx="5731510" cy="2268855"/>
+            <wp:effectExtent l="0" t="0" r="2540" b="0"/>
+            <wp:docPr id="955140339" name="Imagen 1" descr="Texto&#10;&#10;El contenido generado por IA puede ser incorrecto."/>
+            <wp:cNvGraphicFramePr>
+              <a:graphicFrameLocks xmlns:a="http://schemas.openxmlformats.org/drawingml/2006/main" noChangeAspect="1"/>
+            </wp:cNvGraphicFramePr>
+            <a:graphic xmlns:a="http://schemas.openxmlformats.org/drawingml/2006/main">
+              <a:graphicData uri="http://schemas.openxmlformats.org/drawingml/2006/picture">
+                <pic:pic xmlns:pic="http://schemas.openxmlformats.org/drawingml/2006/picture">
+                  <pic:nvPicPr>
+                    <pic:cNvPr id="955140339" name="Imagen 1" descr="Texto&#10;&#10;El contenido generado por IA puede ser incorrecto."/>
+                    <pic:cNvPicPr/>
+                  </pic:nvPicPr>
+                  <pic:blipFill>
+                    <a:blip r:embed="rId18"/>
+                    <a:stretch>
+                      <a:fillRect/>
+                    </a:stretch>
+                  </pic:blipFill>
+                  <pic:spPr>
+                    <a:xfrm>
+                      <a:off x="0" y="0"/>
+                      <a:ext cx="5731510" cy="2268855"/>
+                    </a:xfrm>
+                    <a:prstGeom prst="rect">
+                      <a:avLst/>
+                    </a:prstGeom>
+                  </pic:spPr>
+                </pic:pic>
+              </a:graphicData>
+            </a:graphic>
+          </wp:inline>
+        </w:drawing>
+      </w:r>
+    </w:p>
+    <w:p>
+      <w:pPr>
+        <w:ind w:left="0" w:firstLine="0"/>
+        <w:rPr>
+          <w:lang w:val="es-ES"/>
+        </w:rPr>
+      </w:pPr>
+    </w:p>
+    <w:p>
+      <w:pPr>
+        <w:ind w:left="0" w:firstLine="0"/>
+        <w:rPr>
+          <w:lang w:val="es-ES"/>
+        </w:rPr>
+      </w:pPr>
+    </w:p>
+    <w:p>
+      <w:pPr>
+        <w:ind w:left="0" w:firstLine="0"/>
+        <w:rPr>
+          <w:lang w:val="es-ES"/>
+        </w:rPr>
+      </w:pPr>
+    </w:p>
+    <w:p>
+      <w:pPr>
+        <w:ind w:left="0" w:firstLine="0"/>
+        <w:rPr>
+          <w:lang w:val="es-ES"/>
+        </w:rPr>
+      </w:pPr>
+      <w:r>
+        <w:rPr>
+          <w:lang w:val="es-ES"/>
+        </w:rPr>
+        <w:lastRenderedPageBreak/>
+        <w:drawing>
+          <wp:inline distT="0" distB="0" distL="0" distR="0" wp14:anchorId="1F4E3C38" wp14:editId="18B807F3">
+            <wp:extent cx="5731510" cy="2961005"/>
+            <wp:effectExtent l="0" t="0" r="2540" b="0"/>
+            <wp:docPr id="39350162" name="Imagen 1" descr="Texto&#10;&#10;El contenido generado por IA puede ser incorrecto."/>
+            <wp:cNvGraphicFramePr>
+              <a:graphicFrameLocks xmlns:a="http://schemas.openxmlformats.org/drawingml/2006/main" noChangeAspect="1"/>
+            </wp:cNvGraphicFramePr>
+            <a:graphic xmlns:a="http://schemas.openxmlformats.org/drawingml/2006/main">
+              <a:graphicData uri="http://schemas.openxmlformats.org/drawingml/2006/picture">
+                <pic:pic xmlns:pic="http://schemas.openxmlformats.org/drawingml/2006/picture">
+                  <pic:nvPicPr>
+                    <pic:cNvPr id="39350162" name="Imagen 1" descr="Texto&#10;&#10;El contenido generado por IA puede ser incorrecto."/>
+                    <pic:cNvPicPr/>
+                  </pic:nvPicPr>
+                  <pic:blipFill>
+                    <a:blip r:embed="rId19"/>
+                    <a:stretch>
+                      <a:fillRect/>
+                    </a:stretch>
+                  </pic:blipFill>
+                  <pic:spPr>
+                    <a:xfrm>
+                      <a:off x="0" y="0"/>
+                      <a:ext cx="5731510" cy="2961005"/>
+                    </a:xfrm>
+                    <a:prstGeom prst="rect">
+                      <a:avLst/>
+                    </a:prstGeom>
+                  </pic:spPr>
+                </pic:pic>
+              </a:graphicData>
+            </a:graphic>
+          </wp:inline>
+        </w:drawing>
+      </w:r>
+    </w:p>
+    <w:p>
+      <w:pPr>
+        <w:ind w:left="0" w:firstLine="0"/>
+        <w:rPr>
+          <w:lang w:val="es-ES"/>
+        </w:rPr>
+      </w:pPr>
+    </w:p>
+    <w:p>
+      <w:pPr>
+        <w:ind w:left="0" w:firstLine="0"/>
+        <w:rPr>
+          <w:lang w:val="es-ES"/>
+        </w:rPr>
+      </w:pPr>
+    </w:p>
+    <w:p>
+      <w:pPr>
+        <w:ind w:left="0" w:firstLine="0"/>
+        <w:rPr>
+          <w:lang w:val="es-ES"/>
+        </w:rPr>
+      </w:pPr>
+      <w:r>
+        <w:rPr>
+          <w:lang w:val="es-ES"/>
+        </w:rPr>
+        <w:drawing>
+          <wp:inline distT="0" distB="0" distL="0" distR="0" wp14:anchorId="4A1160A0" wp14:editId="0D9937AD">
+            <wp:extent cx="5087060" cy="3000794"/>
+            <wp:effectExtent l="0" t="0" r="0" b="9525"/>
+            <wp:docPr id="840949502" name="Imagen 1" descr="Texto&#10;&#10;El contenido generado por IA puede ser incorrecto."/>
+            <wp:cNvGraphicFramePr>
+              <a:graphicFrameLocks xmlns:a="http://schemas.openxmlformats.org/drawingml/2006/main" noChangeAspect="1"/>
+            </wp:cNvGraphicFramePr>
+            <a:graphic xmlns:a="http://schemas.openxmlformats.org/drawingml/2006/main">
+              <a:graphicData uri="http://schemas.openxmlformats.org/drawingml/2006/picture">
+                <pic:pic xmlns:pic="http://schemas.openxmlformats.org/drawingml/2006/picture">
+                  <pic:nvPicPr>
+                    <pic:cNvPr id="840949502" name="Imagen 1" descr="Texto&#10;&#10;El contenido generado por IA puede ser incorrecto."/>
+                    <pic:cNvPicPr/>
+                  </pic:nvPicPr>
+                  <pic:blipFill>
+                    <a:blip r:embed="rId20"/>
+                    <a:stretch>
+                      <a:fillRect/>
+                    </a:stretch>
+                  </pic:blipFill>
+                  <pic:spPr>
+                    <a:xfrm>
+                      <a:off x="0" y="0"/>
+                      <a:ext cx="5087060" cy="3000794"/>
+                    </a:xfrm>
+                    <a:prstGeom prst="rect">
+                      <a:avLst/>
+                    </a:prstGeom>
+                  </pic:spPr>
+                </pic:pic>
+              </a:graphicData>
+            </a:graphic>
+          </wp:inline>
+        </w:drawing>
+      </w:r>
+    </w:p>
+    <w:p>
+      <w:pPr>
+        <w:ind w:left="0" w:firstLine="0"/>
+        <w:rPr>
+          <w:lang w:val="es-ES"/>
+        </w:rPr>
+      </w:pPr>
+    </w:p>
+    <w:p>
+      <w:pPr>
+        <w:ind w:left="0" w:firstLine="0"/>
+        <w:rPr>
+          <w:lang w:val="es-ES"/>
+        </w:rPr>
+      </w:pPr>
+    </w:p>
+    <w:p>
+      <w:pPr>
+        <w:ind w:left="0" w:firstLine="0"/>
+        <w:rPr>
+          <w:lang w:val="es-ES"/>
+        </w:rPr>
+      </w:pPr>
+    </w:p>
+    <w:p>
+      <w:pPr>
+        <w:ind w:left="0" w:firstLine="0"/>
+        <w:rPr>
+          <w:lang w:val="es-ES"/>
+        </w:rPr>
+      </w:pPr>
+    </w:p>
+    <w:p>
+      <w:pPr>
+        <w:ind w:left="0" w:firstLine="0"/>
+        <w:rPr>
+          <w:lang w:val="es-ES"/>
+        </w:rPr>
+      </w:pPr>
+    </w:p>
+    <w:p>
+      <w:pPr>
+        <w:ind w:left="0" w:firstLine="0"/>
+        <w:rPr>
+          <w:lang w:val="es-ES"/>
+        </w:rPr>
+      </w:pPr>
+    </w:p>
+    <w:p>
+      <w:pPr>
+        <w:ind w:left="0" w:firstLine="0"/>
+        <w:rPr>
+          <w:lang w:val="es-ES"/>
+        </w:rPr>
+      </w:pPr>
+    </w:p>
+    <w:p>
+      <w:pPr>
+        <w:ind w:left="0" w:firstLine="0"/>
+        <w:rPr>
+          <w:lang w:val="es-ES"/>
+        </w:rPr>
+      </w:pPr>
+    </w:p>
+    <w:p>
+      <w:pPr>
+        <w:ind w:left="0" w:firstLine="0"/>
+        <w:rPr>
+          <w:lang w:val="es-ES"/>
+        </w:rPr>
+      </w:pPr>
+    </w:p>
+    <w:p>
+      <w:pPr>
+        <w:ind w:left="0" w:firstLine="0"/>
+        <w:rPr>
+          <w:lang w:val="es-ES"/>
+        </w:rPr>
+      </w:pPr>
+    </w:p>
+    <w:p>
+      <w:pPr>
+        <w:ind w:left="0" w:firstLine="0"/>
+        <w:rPr>
+          <w:lang w:val="es-ES"/>
+        </w:rPr>
+      </w:pPr>
+    </w:p>
+    <w:p>
+      <w:pPr>
+        <w:ind w:left="0" w:firstLine="0"/>
+        <w:rPr>
+          <w:lang w:val="es-ES"/>
+        </w:rPr>
+      </w:pPr>
+    </w:p>
+    <w:p>
+      <w:pPr>
+        <w:ind w:left="0" w:firstLine="0"/>
+        <w:rPr>
+          <w:b/>
+          <w:bCs/>
+          <w:lang w:val="es-ES"/>
+        </w:rPr>
+      </w:pPr>
+      <w:r>
+        <w:rPr>
+          <w:b/>
+          <w:bCs/>
+          <w:lang w:val="es-ES"/>
+        </w:rPr>
+        <w:lastRenderedPageBreak/>
+        <w:t>Resultados</w:t>
+      </w:r>
+    </w:p>
+    <w:p>
+      <w:pPr>
+        <w:ind w:left="0" w:firstLine="0"/>
+        <w:rPr>
+          <w:b/>
+          <w:bCs/>
+          <w:lang w:val="es-ES"/>
+        </w:rPr>
+      </w:pPr>
+      <w:r>
+        <w:rPr>
+          <w:b/>
+          <w:bCs/>
+          <w:lang w:val="es-ES"/>
+        </w:rPr>
+        <w:drawing>
+          <wp:anchor distT="0" distB="0" distL="114300" distR="114300" simplePos="0" relativeHeight="251665408" behindDoc="0" locked="0" layoutInCell="1" allowOverlap="1" wp14:anchorId="34EA64D3" wp14:editId="5A92811E">
+            <wp:simplePos x="0" y="0"/>
+            <wp:positionH relativeFrom="margin">
+              <wp:align>right</wp:align>
+            </wp:positionH>
+            <wp:positionV relativeFrom="paragraph">
+              <wp:posOffset>214630</wp:posOffset>
+            </wp:positionV>
+            <wp:extent cx="5731510" cy="1670050"/>
+            <wp:effectExtent l="0" t="0" r="2540" b="6350"/>
+            <wp:wrapSquare wrapText="bothSides"/>
+            <wp:docPr id="1194403602" name="Imagen 1" descr="Texto&#10;&#10;El contenido generado por IA puede ser incorrecto."/>
+            <wp:cNvGraphicFramePr>
+              <a:graphicFrameLocks xmlns:a="http://schemas.openxmlformats.org/drawingml/2006/main" noChangeAspect="1"/>
+            </wp:cNvGraphicFramePr>
+            <a:graphic xmlns:a="http://schemas.openxmlformats.org/drawingml/2006/main">
+              <a:graphicData uri="http://schemas.openxmlformats.org/drawingml/2006/picture">
+                <pic:pic xmlns:pic="http://schemas.openxmlformats.org/drawingml/2006/picture">
+                  <pic:nvPicPr>
+                    <pic:cNvPr id="1194403602" name="Imagen 1" descr="Texto&#10;&#10;El contenido generado por IA puede ser incorrecto."/>
+                    <pic:cNvPicPr/>
+                  </pic:nvPicPr>
+                  <pic:blipFill>
+                    <a:blip r:embed="rId21">
+                      <a:extLst>
+                        <a:ext uri="{28A0092B-C50C-407E-A947-70E740481C1C}">
+                          <a14:useLocalDpi xmlns:a14="http://schemas.microsoft.com/office/drawing/2010/main" val="0"/>
+                        </a:ext>
+                      </a:extLst>
+                    </a:blip>
+                    <a:stretch>
+                      <a:fillRect/>
+                    </a:stretch>
+                  </pic:blipFill>
+                  <pic:spPr>
+                    <a:xfrm>
+                      <a:off x="0" y="0"/>
+                      <a:ext cx="5731510" cy="1670050"/>
+                    </a:xfrm>
+                    <a:prstGeom prst="rect">
+                      <a:avLst/>
+                    </a:prstGeom>
+                  </pic:spPr>
+                </pic:pic>
+              </a:graphicData>
+            </a:graphic>
+            <wp14:sizeRelH relativeFrom="page">
+              <wp14:pctWidth>0</wp14:pctWidth>
+            </wp14:sizeRelH>
+            <wp14:sizeRelV relativeFrom="page">
+              <wp14:pctHeight>0</wp14:pctHeight>
+            </wp14:sizeRelV>
+          </wp:anchor>
+        </w:drawing>
       </w:r>
     </w:p>
     <w:sectPr>
@@ -7714,6 +8103,7 @@
   <w:style w:type="character" w:default="1" w:styleId="Fuentedeprrafopredeter">
     <w:name w:val="Default Paragraph Font"/>
     <w:uiPriority w:val="1"/>
+    <w:semiHidden/>
     <w:unhideWhenUsed/>
   </w:style>
   <w:style w:type="table" w:default="1" w:styleId="Tablanormal">
@@ -8425,21 +8815,6 @@
 </file>
 
 <file path=customXml/item1.xml><?xml version="1.0" encoding="utf-8"?>
-<?mso-contentType ?>
-<FormTemplates xmlns="http://schemas.microsoft.com/sharepoint/v3/contenttype/forms">
-  <Display>DocumentLibraryForm</Display>
-  <Edit>DocumentLibraryForm</Edit>
-  <New>DocumentLibraryForm</New>
-</FormTemplates>
-</file>
-
-<file path=customXml/item2.xml><?xml version="1.0" encoding="utf-8"?>
-<p:properties xmlns:p="http://schemas.microsoft.com/office/2006/metadata/properties" xmlns:xsi="http://www.w3.org/2001/XMLSchema-instance" xmlns:pc="http://schemas.microsoft.com/office/infopath/2007/PartnerControls">
-  <documentManagement/>
-</p:properties>
-</file>
-
-<file path=customXml/item3.xml><?xml version="1.0" encoding="utf-8"?>
 <ct:contentTypeSchema xmlns:ct="http://schemas.microsoft.com/office/2006/metadata/contentType" xmlns:ma="http://schemas.microsoft.com/office/2006/metadata/properties/metaAttributes" ct:_="" ma:_="" ma:contentTypeName="Documento" ma:contentTypeID="0x010100D985B953D7955246AC467F8FB30E55AA" ma:contentTypeVersion="7" ma:contentTypeDescription="Crear nuevo documento." ma:contentTypeScope="" ma:versionID="dd3b2a774a0d01d6149a20eddce167bd">
   <xsd:schema xmlns:xsd="http://www.w3.org/2001/XMLSchema" xmlns:xs="http://www.w3.org/2001/XMLSchema" xmlns:p="http://schemas.microsoft.com/office/2006/metadata/properties" xmlns:ns2="df408979-883d-49f1-a779-f06b165858e8" targetNamespace="http://schemas.microsoft.com/office/2006/metadata/properties" ma:root="true" ma:fieldsID="2f478fb1d2abc38112e4910bbb6d4b7c" ns2:_="">
     <xsd:import namespace="df408979-883d-49f1-a779-f06b165858e8"/>
@@ -8601,24 +8976,22 @@
 </ct:contentTypeSchema>
 </file>
 
-<file path=customXml/itemProps1.xml><?xml version="1.0" encoding="utf-8"?>
-<ds:datastoreItem xmlns:ds="http://schemas.openxmlformats.org/officeDocument/2006/customXml" ds:itemID="{EEC59D76-3C90-4DEF-AA4C-E5AF01EC9215}">
-  <ds:schemaRefs>
-    <ds:schemaRef ds:uri="http://schemas.microsoft.com/sharepoint/v3/contenttype/forms"/>
-  </ds:schemaRefs>
-</ds:datastoreItem>
+<file path=customXml/item2.xml><?xml version="1.0" encoding="utf-8"?>
+<p:properties xmlns:p="http://schemas.microsoft.com/office/2006/metadata/properties" xmlns:xsi="http://www.w3.org/2001/XMLSchema-instance" xmlns:pc="http://schemas.microsoft.com/office/infopath/2007/PartnerControls">
+  <documentManagement/>
+</p:properties>
 </file>
 
-<file path=customXml/itemProps2.xml><?xml version="1.0" encoding="utf-8"?>
-<ds:datastoreItem xmlns:ds="http://schemas.openxmlformats.org/officeDocument/2006/customXml" ds:itemID="{ABA67FA4-131F-4400-BCC6-FFFBD324A31F}">
-  <ds:schemaRefs>
-    <ds:schemaRef ds:uri="http://schemas.microsoft.com/office/2006/metadata/properties"/>
-    <ds:schemaRef ds:uri="http://schemas.microsoft.com/office/infopath/2007/PartnerControls"/>
-  </ds:schemaRefs>
-</ds:datastoreItem>
+<file path=customXml/item3.xml><?xml version="1.0" encoding="utf-8"?>
+<?mso-contentType ?>
+<FormTemplates xmlns="http://schemas.microsoft.com/sharepoint/v3/contenttype/forms">
+  <Display>DocumentLibraryForm</Display>
+  <Edit>DocumentLibraryForm</Edit>
+  <New>DocumentLibraryForm</New>
+</FormTemplates>
 </file>
 
-<file path=customXml/itemProps3.xml><?xml version="1.0" encoding="utf-8"?>
+<file path=customXml/itemProps1.xml><?xml version="1.0" encoding="utf-8"?>
 <ds:datastoreItem xmlns:ds="http://schemas.openxmlformats.org/officeDocument/2006/customXml" ds:itemID="{9432F1F2-4446-4888-BB6F-0368DE8A5587}">
   <ds:schemaRefs>
     <ds:schemaRef ds:uri="http://schemas.microsoft.com/office/2006/metadata/contentType"/>
@@ -8634,4 +9007,21 @@
     <ds:schemaRef ds:uri="http://schemas.microsoft.com/internal/obd"/>
   </ds:schemaRefs>
 </ds:datastoreItem>
+</file>
+
+<file path=customXml/itemProps2.xml><?xml version="1.0" encoding="utf-8"?>
+<ds:datastoreItem xmlns:ds="http://schemas.openxmlformats.org/officeDocument/2006/customXml" ds:itemID="{ABA67FA4-131F-4400-BCC6-FFFBD324A31F}">
+  <ds:schemaRefs>
+    <ds:schemaRef ds:uri="http://schemas.microsoft.com/office/2006/metadata/properties"/>
+    <ds:schemaRef ds:uri="http://schemas.microsoft.com/office/infopath/2007/PartnerControls"/>
+  </ds:schemaRefs>
+</ds:datastoreItem>
+</file>
+
+<file path=customXml/itemProps3.xml><?xml version="1.0" encoding="utf-8"?>
+<ds:datastoreItem xmlns:ds="http://schemas.openxmlformats.org/officeDocument/2006/customXml" ds:itemID="{EEC59D76-3C90-4DEF-AA4C-E5AF01EC9215}">
+  <ds:schemaRefs>
+    <ds:schemaRef ds:uri="http://schemas.microsoft.com/sharepoint/v3/contenttype/forms"/>
+  </ds:schemaRefs>
+</ds:datastoreItem>
 </file>
</xml_diff>